<commit_message>
removed snow depth interaction
</commit_message>
<xml_diff>
--- a/reports/thesis/SI_01_chapter_2.docx
+++ b/reports/thesis/SI_01_chapter_2.docx
@@ -538,7 +538,7 @@
               <w:t>3.</w:t>
             </w:r>
             <w:r>
-              <w:t>464512</w:t>
+              <w:t>20041</w:t>
             </w:r>
           </w:p>
         </w:tc>
@@ -554,7 +554,7 @@
               <w:t>0.</w:t>
             </w:r>
             <w:r>
-              <w:t>486385</w:t>
+              <w:t>45126</w:t>
             </w:r>
           </w:p>
         </w:tc>
@@ -567,7 +567,10 @@
               <w:spacing w:line="480" w:lineRule="auto"/>
             </w:pPr>
             <w:r>
-              <w:t>1.06</w:t>
+              <w:t>1.</w:t>
+            </w:r>
+            <w:r>
+              <w:t>32</w:t>
             </w:r>
             <w:r>
               <w:t>e-1</w:t>
@@ -604,7 +607,7 @@
               <w:t>-0.</w:t>
             </w:r>
             <w:r>
-              <w:t>666247</w:t>
+              <w:t>6961</w:t>
             </w:r>
           </w:p>
         </w:tc>
@@ -620,7 +623,7 @@
               <w:t>0.</w:t>
             </w:r>
             <w:r>
-              <w:t>344568</w:t>
+              <w:t>34504</w:t>
             </w:r>
           </w:p>
         </w:tc>
@@ -636,7 +639,7 @@
               <w:t>0.</w:t>
             </w:r>
             <w:r>
-              <w:t>05137</w:t>
+              <w:t>0436</w:t>
             </w:r>
           </w:p>
         </w:tc>
@@ -667,7 +670,7 @@
               <w:t>-0.</w:t>
             </w:r>
             <w:r>
-              <w:t>006317</w:t>
+              <w:t>01509</w:t>
             </w:r>
           </w:p>
         </w:tc>
@@ -683,7 +686,7 @@
               <w:t>0.</w:t>
             </w:r>
             <w:r>
-              <w:t>081774</w:t>
+              <w:t>08052</w:t>
             </w:r>
           </w:p>
         </w:tc>
@@ -699,7 +702,7 @@
               <w:t>0.</w:t>
             </w:r>
             <w:r>
-              <w:t>93843</w:t>
+              <w:t>8513</w:t>
             </w:r>
           </w:p>
         </w:tc>
@@ -730,7 +733,7 @@
               <w:t>-0.</w:t>
             </w:r>
             <w:r>
-              <w:t>137657</w:t>
+              <w:t>22172</w:t>
             </w:r>
           </w:p>
         </w:tc>
@@ -746,7 +749,7 @@
               <w:t>0.</w:t>
             </w:r>
             <w:r>
-              <w:t>219403</w:t>
+              <w:t>21291</w:t>
             </w:r>
           </w:p>
         </w:tc>
@@ -762,7 +765,7 @@
               <w:t>0.</w:t>
             </w:r>
             <w:r>
-              <w:t>53039</w:t>
+              <w:t>2977</w:t>
             </w:r>
           </w:p>
         </w:tc>
@@ -793,7 +796,7 @@
               <w:t>0.</w:t>
             </w:r>
             <w:r>
-              <w:t>153736</w:t>
+              <w:t>1533</w:t>
             </w:r>
           </w:p>
         </w:tc>
@@ -809,7 +812,7 @@
               <w:t>0.</w:t>
             </w:r>
             <w:r>
-              <w:t>453091</w:t>
+              <w:t>45031</w:t>
             </w:r>
           </w:p>
         </w:tc>
@@ -825,7 +828,7 @@
               <w:t>0.</w:t>
             </w:r>
             <w:r>
-              <w:t>73438</w:t>
+              <w:t>7335</w:t>
             </w:r>
           </w:p>
         </w:tc>
@@ -856,7 +859,7 @@
               <w:t>-0.</w:t>
             </w:r>
             <w:r>
-              <w:t>276651</w:t>
+              <w:t>26811</w:t>
             </w:r>
           </w:p>
         </w:tc>
@@ -872,7 +875,7 @@
               <w:t>0.</w:t>
             </w:r>
             <w:r>
-              <w:t>411167</w:t>
+              <w:t>40879</w:t>
             </w:r>
           </w:p>
         </w:tc>
@@ -888,7 +891,7 @@
               <w:t>0.</w:t>
             </w:r>
             <w:r>
-              <w:t>50105</w:t>
+              <w:t>5119</w:t>
             </w:r>
           </w:p>
         </w:tc>
@@ -919,7 +922,7 @@
               <w:t>-0.</w:t>
             </w:r>
             <w:r>
-              <w:t>772858</w:t>
+              <w:t>45791</w:t>
             </w:r>
           </w:p>
         </w:tc>
@@ -935,7 +938,7 @@
               <w:t>0.</w:t>
             </w:r>
             <w:r>
-              <w:t>291237</w:t>
+              <w:t>21111</w:t>
             </w:r>
           </w:p>
         </w:tc>
@@ -951,10 +954,10 @@
               <w:t>0.</w:t>
             </w:r>
             <w:r>
-              <w:t>007</w:t>
-            </w:r>
-            <w:r>
-              <w:t>96</w:t>
+              <w:t>0</w:t>
+            </w:r>
+            <w:r>
+              <w:t>301</w:t>
             </w:r>
           </w:p>
         </w:tc>
@@ -985,7 +988,7 @@
               <w:t>0.</w:t>
             </w:r>
             <w:r>
-              <w:t>692157</w:t>
+              <w:t>21389</w:t>
             </w:r>
           </w:p>
         </w:tc>
@@ -1001,7 +1004,7 @@
               <w:t>0.</w:t>
             </w:r>
             <w:r>
-              <w:t>303785</w:t>
+              <w:t>10407</w:t>
             </w:r>
           </w:p>
         </w:tc>
@@ -1014,10 +1017,10 @@
               <w:spacing w:line="480" w:lineRule="auto"/>
             </w:pPr>
             <w:r>
-              <w:t>0.022</w:t>
-            </w:r>
-            <w:r>
-              <w:t>7</w:t>
+              <w:t>0.0</w:t>
+            </w:r>
+            <w:r>
+              <w:t>399</w:t>
             </w:r>
           </w:p>
         </w:tc>
@@ -1048,7 +1051,7 @@
               <w:t>-0.</w:t>
             </w:r>
             <w:r>
-              <w:t>068685</w:t>
+              <w:t>08523</w:t>
             </w:r>
           </w:p>
         </w:tc>
@@ -1064,7 +1067,7 @@
               <w:t>0.</w:t>
             </w:r>
             <w:r>
-              <w:t>088795</w:t>
+              <w:t>08813</w:t>
             </w:r>
           </w:p>
         </w:tc>
@@ -1080,10 +1083,7 @@
               <w:t>0.</w:t>
             </w:r>
             <w:r>
-              <w:t>4</w:t>
-            </w:r>
-            <w:r>
-              <w:t>3921</w:t>
+              <w:t>3335</w:t>
             </w:r>
           </w:p>
         </w:tc>
@@ -1114,7 +1114,7 @@
               <w:t>0.</w:t>
             </w:r>
             <w:r>
-              <w:t>135405</w:t>
+              <w:t>13422</w:t>
             </w:r>
           </w:p>
         </w:tc>
@@ -1130,7 +1130,7 @@
               <w:t>0.</w:t>
             </w:r>
             <w:r>
-              <w:t>367023</w:t>
+              <w:t>08181</w:t>
             </w:r>
           </w:p>
         </w:tc>
@@ -1146,7 +1146,7 @@
               <w:t>0.</w:t>
             </w:r>
             <w:r>
-              <w:t>09651</w:t>
+              <w:t>1009</w:t>
             </w:r>
           </w:p>
         </w:tc>
@@ -1177,7 +1177,7 @@
               <w:t>-0.</w:t>
             </w:r>
             <w:r>
-              <w:t>121639</w:t>
+              <w:t>13122</w:t>
             </w:r>
           </w:p>
         </w:tc>
@@ -1193,7 +1193,7 @@
               <w:t>0.</w:t>
             </w:r>
             <w:r>
-              <w:t>322264</w:t>
+              <w:t>37016</w:t>
             </w:r>
           </w:p>
         </w:tc>
@@ -1209,79 +1209,7 @@
               <w:t>0.</w:t>
             </w:r>
             <w:r>
-              <w:t>74033</w:t>
-            </w:r>
-          </w:p>
-        </w:tc>
-      </w:tr>
-      <w:tr>
-        <w:tc>
-          <w:tcPr>
-            <w:tcW w:w="2695" w:type="dxa"/>
-          </w:tcPr>
-          <w:p>
-            <w:pPr>
-              <w:spacing w:line="480" w:lineRule="auto"/>
-            </w:pPr>
-            <w:r>
-              <w:t xml:space="preserve">Study period * </w:t>
-            </w:r>
-            <w:r>
-              <w:t>Snow depth</w:t>
-            </w:r>
-          </w:p>
-        </w:tc>
-        <w:tc>
-          <w:tcPr>
-            <w:tcW w:w="1979" w:type="dxa"/>
-          </w:tcPr>
-          <w:p>
-            <w:pPr>
-              <w:spacing w:line="480" w:lineRule="auto"/>
-            </w:pPr>
-            <w:r>
-              <w:t>-</w:t>
-            </w:r>
-            <w:r>
-              <w:t>0.</w:t>
-            </w:r>
-            <w:r>
-              <w:t>54939</w:t>
-            </w:r>
-          </w:p>
-        </w:tc>
-        <w:tc>
-          <w:tcPr>
-            <w:tcW w:w="2338" w:type="dxa"/>
-          </w:tcPr>
-          <w:p>
-            <w:pPr>
-              <w:spacing w:line="480" w:lineRule="auto"/>
-            </w:pPr>
-            <w:r>
-              <w:t>0.</w:t>
-            </w:r>
-            <w:r>
-              <w:t>320752</w:t>
-            </w:r>
-          </w:p>
-        </w:tc>
-        <w:tc>
-          <w:tcPr>
-            <w:tcW w:w="1803" w:type="dxa"/>
-          </w:tcPr>
-          <w:p>
-            <w:pPr>
-              <w:spacing w:line="480" w:lineRule="auto"/>
-            </w:pPr>
-            <w:r>
-              <w:t>0.</w:t>
-            </w:r>
-            <w:r>
-              <w:t>0</w:t>
-            </w:r>
-            <w:r>
-              <w:t>8824</w:t>
+              <w:t>723</w:t>
             </w:r>
           </w:p>
         </w:tc>
@@ -1435,7 +1363,7 @@
               <w:t>3.</w:t>
             </w:r>
             <w:r>
-              <w:t>4663164</w:t>
+              <w:t>207067</w:t>
             </w:r>
           </w:p>
         </w:tc>
@@ -1451,7 +1379,7 @@
               <w:t>0.</w:t>
             </w:r>
             <w:r>
-              <w:t>4867056</w:t>
+              <w:t>451461</w:t>
             </w:r>
           </w:p>
         </w:tc>
@@ -1464,7 +1392,10 @@
               <w:spacing w:line="480" w:lineRule="auto"/>
             </w:pPr>
             <w:r>
-              <w:t>1.06</w:t>
+              <w:t>1.</w:t>
+            </w:r>
+            <w:r>
+              <w:t>21</w:t>
             </w:r>
             <w:r>
               <w:t>e-1</w:t>
@@ -1507,7 +1438,10 @@
               <w:t>-</w:t>
             </w:r>
             <w:r>
-              <w:t>1.7007274</w:t>
+              <w:t>1.</w:t>
+            </w:r>
+            <w:r>
+              <w:t>787469</w:t>
             </w:r>
           </w:p>
         </w:tc>
@@ -1523,7 +1457,7 @@
               <w:t>0.</w:t>
             </w:r>
             <w:r>
-              <w:t>7628913</w:t>
+              <w:t>762235</w:t>
             </w:r>
           </w:p>
         </w:tc>
@@ -1539,7 +1473,7 @@
               <w:t>0.</w:t>
             </w:r>
             <w:r>
-              <w:t>02579</w:t>
+              <w:t>019</w:t>
             </w:r>
           </w:p>
         </w:tc>
@@ -1570,7 +1504,7 @@
               <w:t>-0.</w:t>
             </w:r>
             <w:r>
-              <w:t>0003052</w:t>
+              <w:t>009564</w:t>
             </w:r>
           </w:p>
         </w:tc>
@@ -1586,7 +1520,7 @@
               <w:t>0.</w:t>
             </w:r>
             <w:r>
-              <w:t>0818514</w:t>
+              <w:t>08052</w:t>
             </w:r>
           </w:p>
         </w:tc>
@@ -1602,7 +1536,7 @@
               <w:t>0.</w:t>
             </w:r>
             <w:r>
-              <w:t>99703</w:t>
+              <w:t>9055</w:t>
             </w:r>
           </w:p>
         </w:tc>
@@ -1633,7 +1567,7 @@
               <w:t>-0.</w:t>
             </w:r>
             <w:r>
-              <w:t>1326784</w:t>
+              <w:t>21286</w:t>
             </w:r>
           </w:p>
         </w:tc>
@@ -1649,7 +1583,7 @@
               <w:t>0.</w:t>
             </w:r>
             <w:r>
-              <w:t>2193954</w:t>
+              <w:t>21316</w:t>
             </w:r>
           </w:p>
         </w:tc>
@@ -1665,7 +1599,7 @@
               <w:t>0.</w:t>
             </w:r>
             <w:r>
-              <w:t>54535</w:t>
+              <w:t>318</w:t>
             </w:r>
           </w:p>
         </w:tc>
@@ -1696,7 +1630,7 @@
               <w:t>0.</w:t>
             </w:r>
             <w:r>
-              <w:t>1476903</w:t>
+              <w:t>147209</w:t>
             </w:r>
           </w:p>
         </w:tc>
@@ -1712,7 +1646,7 @@
               <w:t>0.</w:t>
             </w:r>
             <w:r>
-              <w:t>4534306</w:t>
+              <w:t>450599</w:t>
             </w:r>
           </w:p>
         </w:tc>
@@ -1728,7 +1662,7 @@
               <w:t>0.</w:t>
             </w:r>
             <w:r>
-              <w:t>74464</w:t>
+              <w:t>7439</w:t>
             </w:r>
           </w:p>
         </w:tc>
@@ -1759,7 +1693,7 @@
               <w:t>-0.</w:t>
             </w:r>
             <w:r>
-              <w:t>2716819</w:t>
+              <w:t>263507</w:t>
             </w:r>
           </w:p>
         </w:tc>
@@ -1775,7 +1709,7 @@
               <w:t>0.</w:t>
             </w:r>
             <w:r>
-              <w:t>4114789</w:t>
+              <w:t>209054</w:t>
             </w:r>
           </w:p>
         </w:tc>
@@ -1791,7 +1725,7 @@
               <w:t>0.</w:t>
             </w:r>
             <w:r>
-              <w:t>50909</w:t>
+              <w:t>5195</w:t>
             </w:r>
           </w:p>
         </w:tc>
@@ -1822,7 +1756,7 @@
               <w:t>-0.</w:t>
             </w:r>
             <w:r>
-              <w:t>7935797</w:t>
+              <w:t>486536</w:t>
             </w:r>
           </w:p>
         </w:tc>
@@ -1838,7 +1772,7 @@
               <w:t>0.</w:t>
             </w:r>
             <w:r>
-              <w:t>2897351</w:t>
+              <w:t>209671</w:t>
             </w:r>
           </w:p>
         </w:tc>
@@ -1854,7 +1788,7 @@
               <w:t>0.</w:t>
             </w:r>
             <w:r>
-              <w:t>00616</w:t>
+              <w:t>0203</w:t>
             </w:r>
           </w:p>
         </w:tc>
@@ -1885,7 +1819,7 @@
               <w:t>0.</w:t>
             </w:r>
             <w:r>
-              <w:t>6869596</w:t>
+              <w:t>219733</w:t>
             </w:r>
           </w:p>
         </w:tc>
@@ -1901,7 +1835,7 @@
               <w:t>0.</w:t>
             </w:r>
             <w:r>
-              <w:t>3037364</w:t>
+              <w:t>103918</w:t>
             </w:r>
           </w:p>
         </w:tc>
@@ -1917,7 +1851,7 @@
               <w:t>0.</w:t>
             </w:r>
             <w:r>
-              <w:t>02372</w:t>
+              <w:t>0345</w:t>
             </w:r>
           </w:p>
         </w:tc>
@@ -1948,7 +1882,7 @@
               <w:t>-0.</w:t>
             </w:r>
             <w:r>
-              <w:t>0660276</w:t>
+              <w:t>082392</w:t>
             </w:r>
           </w:p>
         </w:tc>
@@ -1964,7 +1898,7 @@
               <w:t>0.</w:t>
             </w:r>
             <w:r>
-              <w:t>0891474</w:t>
+              <w:t>088499</w:t>
             </w:r>
           </w:p>
         </w:tc>
@@ -1980,7 +1914,7 @@
               <w:t>0.</w:t>
             </w:r>
             <w:r>
-              <w:t>4589</w:t>
+              <w:t>3519</w:t>
             </w:r>
           </w:p>
         </w:tc>
@@ -2011,7 +1945,7 @@
               <w:t>0.</w:t>
             </w:r>
             <w:r>
-              <w:t>1348837</w:t>
+              <w:t>133538</w:t>
             </w:r>
           </w:p>
         </w:tc>
@@ -2027,7 +1961,7 @@
               <w:t>0.</w:t>
             </w:r>
             <w:r>
-              <w:t>0813814</w:t>
+              <w:t>081714</w:t>
             </w:r>
           </w:p>
         </w:tc>
@@ -2043,7 +1977,7 @@
               <w:t>0.</w:t>
             </w:r>
             <w:r>
-              <w:t>09743</w:t>
+              <w:t>1022</w:t>
             </w:r>
           </w:p>
         </w:tc>
@@ -2074,7 +2008,7 @@
               <w:t>-0.</w:t>
             </w:r>
             <w:r>
-              <w:t>2225853</w:t>
+              <w:t>203941</w:t>
             </w:r>
           </w:p>
         </w:tc>
@@ -2090,7 +2024,7 @@
               <w:t>0.</w:t>
             </w:r>
             <w:r>
-              <w:t>7130664</w:t>
+              <w:t>728073</w:t>
             </w:r>
           </w:p>
         </w:tc>
@@ -2106,76 +2040,7 @@
               <w:t>0.</w:t>
             </w:r>
             <w:r>
-              <w:t>75492</w:t>
-            </w:r>
-          </w:p>
-        </w:tc>
-      </w:tr>
-      <w:tr>
-        <w:tc>
-          <w:tcPr>
-            <w:tcW w:w="2695" w:type="dxa"/>
-          </w:tcPr>
-          <w:p>
-            <w:pPr>
-              <w:spacing w:line="480" w:lineRule="auto"/>
-            </w:pPr>
-            <w:r>
-              <w:t xml:space="preserve">Study period * </w:t>
-            </w:r>
-            <w:r>
-              <w:t>Snow depth</w:t>
-            </w:r>
-          </w:p>
-        </w:tc>
-        <w:tc>
-          <w:tcPr>
-            <w:tcW w:w="1979" w:type="dxa"/>
-          </w:tcPr>
-          <w:p>
-            <w:pPr>
-              <w:spacing w:line="480" w:lineRule="auto"/>
-            </w:pPr>
-            <w:r>
-              <w:t>-</w:t>
-            </w:r>
-            <w:r>
-              <w:t>0.</w:t>
-            </w:r>
-            <w:r>
-              <w:t>5372139</w:t>
-            </w:r>
-          </w:p>
-        </w:tc>
-        <w:tc>
-          <w:tcPr>
-            <w:tcW w:w="2338" w:type="dxa"/>
-          </w:tcPr>
-          <w:p>
-            <w:pPr>
-              <w:spacing w:line="480" w:lineRule="auto"/>
-            </w:pPr>
-            <w:r>
-              <w:t>0.</w:t>
-            </w:r>
-            <w:r>
-              <w:t>3226631</w:t>
-            </w:r>
-          </w:p>
-        </w:tc>
-        <w:tc>
-          <w:tcPr>
-            <w:tcW w:w="1803" w:type="dxa"/>
-          </w:tcPr>
-          <w:p>
-            <w:pPr>
-              <w:spacing w:line="480" w:lineRule="auto"/>
-            </w:pPr>
-            <w:r>
-              <w:t>0.</w:t>
-            </w:r>
-            <w:r>
-              <w:t>09593</w:t>
+              <w:t>7794</w:t>
             </w:r>
           </w:p>
         </w:tc>

</xml_diff>